<commit_message>
Datensicherung in den Rechtstexten benannt
Der Kunde muss vor dem Vertragsschluss wissen, was eine Wiederherstellung
bedeutet. In AGB Ziff. 10, AVV Ziff. 6 und der Datenschutzerklaerung steht
jetzt dieselbe Aussage: taegliche Sicherung, sieben Tage Aufbewahrung,
Wiederherstellung auf den Stand der letzten Sicherung - dabei koennen die
Daten eines Tages verloren gehen. Point-in-Time-Recovery ist nicht
eingerichtet.

Dazu die Frist fuer das Ueberschreiben der Sicherungen nach Vertragsende
von 30 auf sieben Tage korrigiert - 30 Tage waren schlicht falsch.

Co-Authored-By: Claude Opus 5 <noreply@anthropic.com>
</commit_message>
<xml_diff>
--- a/docs/ArcoTime-Rechtstexte.docx
+++ b/docs/ArcoTime-Rechtstexte.docx
@@ -1516,13 +1516,7 @@
         <w:t xml:space="preserve">Sicherungskopien</w:t>
       </w:r>
       <w:r>
-        <w:t xml:space="preserve">: werden im normalen Rhythmus überschrieben, längstens</w:t>
-      </w:r>
-      <w:r>
-        <w:t xml:space="preserve"> </w:t>
-      </w:r>
-      <w:r>
-        <w:t xml:space="preserve">nach dreissig Tagen.</w:t>
+        <w:t xml:space="preserve">: werden nach sieben Tagen überschrieben.</w:t>
       </w:r>
     </w:p>
     <w:bookmarkEnd w:id="31"/>
@@ -1564,7 +1558,25 @@
         <w:t xml:space="preserve"> </w:t>
       </w:r>
       <w:r>
-        <w:t xml:space="preserve">Änderungsprotokoll sowie tägliche Sicherungen. Zugriff auf Kundendaten haben</w:t>
+        <w:t xml:space="preserve">Änderungsprotokoll sowie tägliche Sicherungen, die sieben Tage aufbewahrt</w:t>
+      </w:r>
+      <w:r>
+        <w:t xml:space="preserve"> </w:t>
+      </w:r>
+      <w:r>
+        <w:t xml:space="preserve">werden. Eine Wiederherstellung erfolgt auf den Stand der letzten Sicherung;</w:t>
+      </w:r>
+      <w:r>
+        <w:t xml:space="preserve"> </w:t>
+      </w:r>
+      <w:r>
+        <w:t xml:space="preserve">dabei können die Daten des letzten Tages verloren gehen. Zugriff auf</w:t>
+      </w:r>
+      <w:r>
+        <w:t xml:space="preserve"> </w:t>
+      </w:r>
+      <w:r>
+        <w:t xml:space="preserve">Kundendaten haben</w:t>
       </w:r>
       <w:r>
         <w:t xml:space="preserve"> </w:t>
@@ -2650,6 +2662,108 @@
         <w:pStyle w:val="BodyText"/>
       </w:pPr>
       <w:r>
+        <w:rPr>
+          <w:b/>
+          <w:bCs/>
+        </w:rPr>
+        <w:t xml:space="preserve">Datensicherung.</w:t>
+      </w:r>
+      <w:r>
+        <w:t xml:space="preserve"> </w:t>
+      </w:r>
+      <w:r>
+        <w:t xml:space="preserve">Arcos sichert die Datenbank</w:t>
+      </w:r>
+      <w:r>
+        <w:t xml:space="preserve"> </w:t>
+      </w:r>
+      <w:r>
+        <w:rPr>
+          <w:b/>
+          <w:bCs/>
+        </w:rPr>
+        <w:t xml:space="preserve">täglich</w:t>
+      </w:r>
+      <w:r>
+        <w:t xml:space="preserve"> </w:t>
+      </w:r>
+      <w:r>
+        <w:t xml:space="preserve">und bewahrt die</w:t>
+      </w:r>
+      <w:r>
+        <w:t xml:space="preserve"> </w:t>
+      </w:r>
+      <w:r>
+        <w:t xml:space="preserve">Sicherungen</w:t>
+      </w:r>
+      <w:r>
+        <w:t xml:space="preserve"> </w:t>
+      </w:r>
+      <w:r>
+        <w:rPr>
+          <w:b/>
+          <w:bCs/>
+        </w:rPr>
+        <w:t xml:space="preserve">sieben Tage</w:t>
+      </w:r>
+      <w:r>
+        <w:t xml:space="preserve"> </w:t>
+      </w:r>
+      <w:r>
+        <w:t xml:space="preserve">auf. Muss auf eine Sicherung zurückgegriffen</w:t>
+      </w:r>
+      <w:r>
+        <w:t xml:space="preserve"> </w:t>
+      </w:r>
+      <w:r>
+        <w:t xml:space="preserve">werden, wird der Stand der letzten Sicherung wiederhergestellt; seither</w:t>
+      </w:r>
+      <w:r>
+        <w:t xml:space="preserve"> </w:t>
+      </w:r>
+      <w:r>
+        <w:t xml:space="preserve">erfasste Daten –</w:t>
+      </w:r>
+      <w:r>
+        <w:t xml:space="preserve"> </w:t>
+      </w:r>
+      <w:r>
+        <w:rPr>
+          <w:b/>
+          <w:bCs/>
+        </w:rPr>
+        <w:t xml:space="preserve">längstens die eines Tages</w:t>
+      </w:r>
+      <w:r>
+        <w:t xml:space="preserve"> </w:t>
+      </w:r>
+      <w:r>
+        <w:t xml:space="preserve">– können dabei verloren gehen.</w:t>
+      </w:r>
+      <w:r>
+        <w:t xml:space="preserve"> </w:t>
+      </w:r>
+      <w:r>
+        <w:t xml:space="preserve">Eine weitergehende Wiederherstellung schuldet Arcos nicht. Dem Kunden wird</w:t>
+      </w:r>
+      <w:r>
+        <w:t xml:space="preserve"> </w:t>
+      </w:r>
+      <w:r>
+        <w:t xml:space="preserve">empfohlen, für ihn wesentliche Auswertungen zusätzlich selbst zu exportieren</w:t>
+      </w:r>
+      <w:r>
+        <w:t xml:space="preserve"> </w:t>
+      </w:r>
+      <w:r>
+        <w:t xml:space="preserve">und aufzubewahren.</w:t>
+      </w:r>
+    </w:p>
+    <w:p>
+      <w:pPr>
+        <w:pStyle w:val="BodyText"/>
+      </w:pPr>
+      <w:r>
         <w:t xml:space="preserve">Nach Vertragsende bleiben die Daten</w:t>
       </w:r>
       <w:r>
@@ -2672,13 +2786,29 @@
         <w:t xml:space="preserve"> </w:t>
       </w:r>
       <w:r>
-        <w:t xml:space="preserve">einen Export vornehmen kann. Danach werden sie gelöscht; Sicherungskopien</w:t>
-      </w:r>
-      <w:r>
-        <w:t xml:space="preserve"> </w:t>
-      </w:r>
-      <w:r>
-        <w:t xml:space="preserve">werden im normalen Rhythmus überschrieben, längstens innert weiterer 30 Tage.</w:t>
+        <w:t xml:space="preserve">einen Export vornehmen kann. Danach werden sie gelöscht; die Sicherungskopien</w:t>
+      </w:r>
+      <w:r>
+        <w:t xml:space="preserve"> </w:t>
+      </w:r>
+      <w:r>
+        <w:t xml:space="preserve">werden innert weiterer</w:t>
+      </w:r>
+      <w:r>
+        <w:t xml:space="preserve"> </w:t>
+      </w:r>
+      <w:r>
+        <w:rPr>
+          <w:b/>
+          <w:bCs/>
+        </w:rPr>
+        <w:t xml:space="preserve">sieben Tage</w:t>
+      </w:r>
+      <w:r>
+        <w:t xml:space="preserve"> </w:t>
+      </w:r>
+      <w:r>
+        <w:t xml:space="preserve">überschrieben.</w:t>
       </w:r>
       <w:r>
         <w:t xml:space="preserve"> </w:t>
@@ -3944,16 +4074,99 @@
           <w:b/>
           <w:bCs/>
         </w:rPr>
-        <w:t xml:space="preserve">Verfügbarkeit</w:t>
-      </w:r>
-      <w:r>
-        <w:t xml:space="preserve">: tägliche Sicherungen mit einer Aufbewahrung von mindestens</w:t>
-      </w:r>
-      <w:r>
-        <w:t xml:space="preserve"> </w:t>
-      </w:r>
-      <w:r>
-        <w:t xml:space="preserve">sieben Tagen.</w:t>
+        <w:t xml:space="preserve">Verfügbarkeit und Wiederherstellung</w:t>
+      </w:r>
+      <w:r>
+        <w:t xml:space="preserve">: Die Datenbank wird</w:t>
+      </w:r>
+      <w:r>
+        <w:t xml:space="preserve"> </w:t>
+      </w:r>
+      <w:r>
+        <w:rPr>
+          <w:b/>
+          <w:bCs/>
+        </w:rPr>
+        <w:t xml:space="preserve">täglich</w:t>
+      </w:r>
+      <w:r>
+        <w:rPr>
+          <w:b/>
+          <w:bCs/>
+        </w:rPr>
+        <w:t xml:space="preserve"> </w:t>
+      </w:r>
+      <w:r>
+        <w:rPr>
+          <w:b/>
+          <w:bCs/>
+        </w:rPr>
+        <w:t xml:space="preserve">gesichert</w:t>
+      </w:r>
+      <w:r>
+        <w:t xml:space="preserve">; die Sicherungen werden</w:t>
+      </w:r>
+      <w:r>
+        <w:t xml:space="preserve"> </w:t>
+      </w:r>
+      <w:r>
+        <w:rPr>
+          <w:b/>
+          <w:bCs/>
+        </w:rPr>
+        <w:t xml:space="preserve">sieben Tage</w:t>
+      </w:r>
+      <w:r>
+        <w:t xml:space="preserve"> </w:t>
+      </w:r>
+      <w:r>
+        <w:t xml:space="preserve">aufbewahrt. Eine</w:t>
+      </w:r>
+      <w:r>
+        <w:t xml:space="preserve"> </w:t>
+      </w:r>
+      <w:r>
+        <w:t xml:space="preserve">Wiederherstellung erfolgt auf den Stand der letzten Sicherung. Dabei können</w:t>
+      </w:r>
+      <w:r>
+        <w:t xml:space="preserve"> </w:t>
+      </w:r>
+      <w:r>
+        <w:t xml:space="preserve">die seither erfassten Änderungen –</w:t>
+      </w:r>
+      <w:r>
+        <w:t xml:space="preserve"> </w:t>
+      </w:r>
+      <w:r>
+        <w:rPr>
+          <w:b/>
+          <w:bCs/>
+        </w:rPr>
+        <w:t xml:space="preserve">längstens eines Tages</w:t>
+      </w:r>
+      <w:r>
+        <w:t xml:space="preserve"> </w:t>
+      </w:r>
+      <w:r>
+        <w:t xml:space="preserve">– verloren</w:t>
+      </w:r>
+      <w:r>
+        <w:t xml:space="preserve"> </w:t>
+      </w:r>
+      <w:r>
+        <w:t xml:space="preserve">gehen. Eine Wiederherstellung auf einen beliebigen Zeitpunkt</w:t>
+      </w:r>
+      <w:r>
+        <w:t xml:space="preserve"> </w:t>
+      </w:r>
+      <w:r>
+        <w:t xml:space="preserve">(Point-in-Time-Recovery) ist nicht eingerichtet; sie kann gegen Aufpreis</w:t>
+      </w:r>
+      <w:r>
+        <w:t xml:space="preserve"> </w:t>
+      </w:r>
+      <w:r>
+        <w:t xml:space="preserve">vereinbart werden.</w:t>
       </w:r>
     </w:p>
     <w:p>
@@ -4255,19 +4468,35 @@
         <w:t xml:space="preserve"> </w:t>
       </w:r>
       <w:r>
-        <w:t xml:space="preserve">sie exportieren kann. Danach löscht Arcos sämtliche Daten des Kunden.</w:t>
-      </w:r>
-      <w:r>
-        <w:t xml:space="preserve"> </w:t>
-      </w:r>
-      <w:r>
-        <w:t xml:space="preserve">Sicherungskopien werden im normalen Rhythmus überschrieben, längstens innert</w:t>
-      </w:r>
-      <w:r>
-        <w:t xml:space="preserve"> </w:t>
-      </w:r>
-      <w:r>
-        <w:t xml:space="preserve">weiterer 30 Tage.</w:t>
+        <w:t xml:space="preserve">sie exportieren kann. Danach löscht Arcos sämtliche Daten des Kunden. Die</w:t>
+      </w:r>
+      <w:r>
+        <w:t xml:space="preserve"> </w:t>
+      </w:r>
+      <w:r>
+        <w:t xml:space="preserve">Sicherungskopien werden innert weiterer</w:t>
+      </w:r>
+      <w:r>
+        <w:t xml:space="preserve"> </w:t>
+      </w:r>
+      <w:r>
+        <w:rPr>
+          <w:b/>
+          <w:bCs/>
+        </w:rPr>
+        <w:t xml:space="preserve">sieben Tage</w:t>
+      </w:r>
+      <w:r>
+        <w:t xml:space="preserve"> </w:t>
+      </w:r>
+      <w:r>
+        <w:t xml:space="preserve">überschrieben; bis</w:t>
+      </w:r>
+      <w:r>
+        <w:t xml:space="preserve"> </w:t>
+      </w:r>
+      <w:r>
+        <w:t xml:space="preserve">dahin sind die Daten dort noch enthalten, aber nicht mehr zugänglich.</w:t>
       </w:r>
     </w:p>
     <w:p>

</xml_diff>